<commit_message>
Paper 12 v1.4 PUBLISHED on Zenodo \u2014 DOI 10.5281/zenodo.20093296
Live deposit:
  https://doi.org/10.5281/zenodo.20093296

Honest reframe of \u00a75.7. New version of v1.3 (DOI 10.5281/zenodo.20060751)
on the same Zenodo concept-DOI; v1.3 preserved for the historical record.

Submission timeline (v1.3 \u2192 v1.4):
- 2026-05-06 ~22:30 PDT: v1.3 published, DOI 10.5281/zenodo.20060751
- 2026-05-07: Opus 4.7 traces forensic data flow, identifies 4 issues
- 2026-05-08 ~23:30 PDT: v1.4 honest-reframe master built, tagged
- 2026-05-09 ~00:30 PDT: v1.4 published, DOI 10.5281/zenodo.20093296

Total time from critique to published correction: ~26 hours.

Files updated this commit:
- paper12_master_v1.4.md/.docx/.pdf \u2014 DOI baked into header & status
- zenodo_v1.4/README_v1.4.md \u2014 citation + BibTeX with live DOI
- todos/TODO_MASTER_ROADMAP.md \u2014 both v1.3 and v1.4 entries

Tag: paper12-v1.4-published
</commit_message>
<xml_diff>
--- a/outbox/paper12/paper12_master_v1.4.docx
+++ b/outbox/paper12/paper12_master_v1.4.docx
@@ -2722,7 +2722,7 @@
         <w:t xml:space="preserve">whole.</w:t>
       </w:r>
     </w:p>
-    <w:bookmarkStart w:id="102" w:name="paper-12-the-gradual-tear"/>
+    <w:bookmarkStart w:id="103" w:name="paper-12-the-gradual-tear"/>
     <w:p>
       <w:pPr>
         <w:pStyle w:val="Heading1"/>
@@ -2823,18 +2823,42 @@
           <w:b/>
           <w:bCs/>
         </w:rPr>
-        <w:t xml:space="preserve">Master assembly v1.4 — 2026-05-08 — honest reframe of §5.7 superseding v1.3.</w:t>
-      </w:r>
-      <w:r>
-        <w:t xml:space="preserve"> </w:t>
-      </w:r>
-      <w:r>
-        <w:t xml:space="preserve">v1.3 published on Zenodo at</w:t>
-      </w:r>
-      <w:r>
+        <w:t xml:space="preserve">Master assembly v1.4 — published on Zenodo at</w:t>
+      </w:r>
+      <w:r>
+        <w:rPr>
+          <w:b/>
+          <w:bCs/>
+        </w:rPr>
         <w:t xml:space="preserve"> </w:t>
       </w:r>
       <w:hyperlink r:id="rId20">
+        <w:r>
+          <w:rPr>
+            <w:rStyle w:val="Hyperlink"/>
+            <w:b/>
+            <w:bCs/>
+          </w:rPr>
+          <w:t xml:space="preserve">DOI: 10.5281/zenodo.20093296</w:t>
+        </w:r>
+      </w:hyperlink>
+      <w:r>
+        <w:rPr>
+          <w:b/>
+          <w:bCs/>
+        </w:rPr>
+        <w:t xml:space="preserve">, 2026-05-08 — honest reframe of §5.7 superseding v1.3.</w:t>
+      </w:r>
+      <w:r>
+        <w:t xml:space="preserve"> </w:t>
+      </w:r>
+      <w:r>
+        <w:t xml:space="preserve">v1.3 remains on Zenodo at</w:t>
+      </w:r>
+      <w:r>
+        <w:t xml:space="preserve"> </w:t>
+      </w:r>
+      <w:hyperlink r:id="rId21">
         <w:r>
           <w:rPr>
             <w:rStyle w:val="Hyperlink"/>
@@ -2843,7 +2867,10 @@
         </w:r>
       </w:hyperlink>
       <w:r>
-        <w:t xml:space="preserve">; v1.4 corrects an overclaim in v1.3’s §5.7 framing (see Erratum 5.7.0 below) and is the recommended citation.</w:t>
+        <w:t xml:space="preserve"> </w:t>
+      </w:r>
+      <w:r>
+        <w:t xml:space="preserve">for the historical record; v1.4 corrects an overclaim in v1.3’s §5.7 framing (see Erratum 5.7.0 below) and is the recommended citation.</w:t>
       </w:r>
     </w:p>
     <w:p>
@@ -2900,7 +2927,7 @@
       <w:r>
         <w:t xml:space="preserve"> </w:t>
       </w:r>
-      <w:hyperlink r:id="rId21">
+      <w:hyperlink r:id="rId22">
         <w:r>
           <w:rPr>
             <w:rStyle w:val="Hyperlink"/>
@@ -2924,7 +2951,7 @@
       <w:r>
         <w:t xml:space="preserve"> </w:t>
       </w:r>
-      <w:hyperlink r:id="rId22">
+      <w:hyperlink r:id="rId23">
         <w:r>
           <w:rPr>
             <w:rStyle w:val="Hyperlink"/>
@@ -2961,10 +2988,94 @@
         <w:rPr>
           <w:rStyle w:val="VerbatimChar"/>
         </w:rPr>
+        <w:t xml:space="preserve">paper12-v1.4-published</w:t>
+      </w:r>
+      <w:r>
+        <w:t xml:space="preserve">. Earlier tags:</w:t>
+      </w:r>
+      <w:r>
+        <w:t xml:space="preserve"> </w:t>
+      </w:r>
+      <w:r>
+        <w:rPr>
+          <w:rStyle w:val="VerbatimChar"/>
+        </w:rPr>
+        <w:t xml:space="preserve">paper12-v1.0-assembly</w:t>
+      </w:r>
+      <w:r>
+        <w:t xml:space="preserve">,</w:t>
+      </w:r>
+      <w:r>
+        <w:t xml:space="preserve"> </w:t>
+      </w:r>
+      <w:r>
+        <w:rPr>
+          <w:rStyle w:val="VerbatimChar"/>
+        </w:rPr>
+        <w:t xml:space="preserve">paper12-v1.1-council-revised</w:t>
+      </w:r>
+      <w:r>
+        <w:t xml:space="preserve">,</w:t>
+      </w:r>
+      <w:r>
+        <w:t xml:space="preserve"> </w:t>
+      </w:r>
+      <w:r>
+        <w:rPr>
+          <w:rStyle w:val="VerbatimChar"/>
+        </w:rPr>
+        <w:t xml:space="preserve">paper12-v1.2-tensor-companion</w:t>
+      </w:r>
+      <w:r>
+        <w:t xml:space="preserve">,</w:t>
+      </w:r>
+      <w:r>
+        <w:t xml:space="preserve"> </w:t>
+      </w:r>
+      <w:r>
+        <w:rPr>
+          <w:rStyle w:val="VerbatimChar"/>
+        </w:rPr>
+        <w:t xml:space="preserve">paper12-v1.3-empirical-n1</w:t>
+      </w:r>
+      <w:r>
+        <w:t xml:space="preserve">,</w:t>
+      </w:r>
+      <w:r>
+        <w:t xml:space="preserve"> </w:t>
+      </w:r>
+      <w:r>
+        <w:rPr>
+          <w:rStyle w:val="VerbatimChar"/>
+        </w:rPr>
+        <w:t xml:space="preserve">paper12-v1.3-zenodo</w:t>
+      </w:r>
+      <w:r>
+        <w:t xml:space="preserve">,</w:t>
+      </w:r>
+      <w:r>
+        <w:t xml:space="preserve"> </w:t>
+      </w:r>
+      <w:r>
+        <w:rPr>
+          <w:rStyle w:val="VerbatimChar"/>
+        </w:rPr>
+        <w:t xml:space="preserve">paper12-v1.3-published</w:t>
+      </w:r>
+      <w:r>
+        <w:t xml:space="preserve">,</w:t>
+      </w:r>
+      <w:r>
+        <w:t xml:space="preserve"> </w:t>
+      </w:r>
+      <w:r>
+        <w:rPr>
+          <w:rStyle w:val="VerbatimChar"/>
+        </w:rPr>
         <w:t xml:space="preserve">paper12-v1.4-honest-reframe</w:t>
       </w:r>
       <w:r>
-        <w:t xml:space="preserve">. Earlier tags:</w:t>
+        <w:t xml:space="preserve">,</w:t>
       </w:r>
       <w:r>
         <w:t xml:space="preserve"> </w:t>
@@ -2973,67 +3084,7 @@
         <w:rPr>
           <w:rStyle w:val="VerbatimChar"/>
         </w:rPr>
-        <w:t xml:space="preserve">paper12-v1.0-assembly</w:t>
-      </w:r>
-      <w:r>
-        <w:t xml:space="preserve">,</w:t>
-      </w:r>
-      <w:r>
-        <w:t xml:space="preserve"> </w:t>
-      </w:r>
-      <w:r>
-        <w:rPr>
-          <w:rStyle w:val="VerbatimChar"/>
-        </w:rPr>
-        <w:t xml:space="preserve">paper12-v1.1-council-revised</w:t>
-      </w:r>
-      <w:r>
-        <w:t xml:space="preserve">,</w:t>
-      </w:r>
-      <w:r>
-        <w:t xml:space="preserve"> </w:t>
-      </w:r>
-      <w:r>
-        <w:rPr>
-          <w:rStyle w:val="VerbatimChar"/>
-        </w:rPr>
-        <w:t xml:space="preserve">paper12-v1.2-tensor-companion</w:t>
-      </w:r>
-      <w:r>
-        <w:t xml:space="preserve">,</w:t>
-      </w:r>
-      <w:r>
-        <w:t xml:space="preserve"> </w:t>
-      </w:r>
-      <w:r>
-        <w:rPr>
-          <w:rStyle w:val="VerbatimChar"/>
-        </w:rPr>
-        <w:t xml:space="preserve">paper12-v1.3-empirical-n1</w:t>
-      </w:r>
-      <w:r>
-        <w:t xml:space="preserve">,</w:t>
-      </w:r>
-      <w:r>
-        <w:t xml:space="preserve"> </w:t>
-      </w:r>
-      <w:r>
-        <w:rPr>
-          <w:rStyle w:val="VerbatimChar"/>
-        </w:rPr>
-        <w:t xml:space="preserve">paper12-v1.3-zenodo</w:t>
-      </w:r>
-      <w:r>
-        <w:t xml:space="preserve">,</w:t>
-      </w:r>
-      <w:r>
-        <w:t xml:space="preserve"> </w:t>
-      </w:r>
-      <w:r>
-        <w:rPr>
-          <w:rStyle w:val="VerbatimChar"/>
-        </w:rPr>
-        <w:t xml:space="preserve">paper12-v1.3-published</w:t>
+        <w:t xml:space="preserve">paper12-v1.4-honest-reframe-zenodo</w:t>
       </w:r>
       <w:r>
         <w:t xml:space="preserve">. v1.4 supersedes v1.3 by reframing §5.7 from</w:t>
@@ -3104,12 +3155,23 @@
         <w:t xml:space="preserve"> </w:t>
       </w:r>
       <w:r>
-        <w:t xml:space="preserve">v1.3 published on Zenodo at</w:t>
+        <w:t xml:space="preserve">v1.4 published on Zenodo at</w:t>
       </w:r>
       <w:r>
         <w:t xml:space="preserve"> </w:t>
       </w:r>
       <w:hyperlink r:id="rId20">
+        <w:r>
+          <w:rPr>
+            <w:rStyle w:val="Hyperlink"/>
+          </w:rPr>
+          <w:t xml:space="preserve">DOI 10.5281/zenodo.20093296</w:t>
+        </w:r>
+      </w:hyperlink>
+      <w:r>
+        <w:t xml:space="preserve">, 2026-05-08, as a new version of v1.3 (</w:t>
+      </w:r>
+      <w:hyperlink r:id="rId21">
         <w:r>
           <w:rPr>
             <w:rStyle w:val="Hyperlink"/>
@@ -3118,7 +3180,7 @@
         </w:r>
       </w:hyperlink>
       <w:r>
-        <w:t xml:space="preserve">, 2026-05-06. v1.4 (this version, 2026-05-08) is an honest-reframe revision: §§3–4 mathematics unchanged; §5.7 demoted from</w:t>
+        <w:t xml:space="preserve">, 2026-05-06). v1.4 is an honest-reframe revision: §§3–4 mathematics unchanged; §5.7 demoted from</w:t>
       </w:r>
       <w:r>
         <w:t xml:space="preserve"> </w:t>
@@ -3469,7 +3531,7 @@
         </w:pict>
       </w:r>
     </w:p>
-    <w:bookmarkStart w:id="23" w:name="contents"/>
+    <w:bookmarkStart w:id="24" w:name="contents"/>
     <w:p>
       <w:pPr>
         <w:pStyle w:val="Heading2"/>
@@ -3684,8 +3746,8 @@
         </w:pict>
       </w:r>
     </w:p>
-    <w:bookmarkEnd w:id="23"/>
-    <w:bookmarkStart w:id="29" w:name="introduction"/>
+    <w:bookmarkEnd w:id="24"/>
+    <w:bookmarkStart w:id="30" w:name="introduction"/>
     <w:p>
       <w:pPr>
         <w:pStyle w:val="Heading2"/>
@@ -3694,7 +3756,7 @@
         <w:t xml:space="preserve">1. Introduction</w:t>
       </w:r>
     </w:p>
-    <w:bookmarkStart w:id="24" w:name="the-third-attractor"/>
+    <w:bookmarkStart w:id="25" w:name="the-third-attractor"/>
     <w:p>
       <w:pPr>
         <w:pStyle w:val="Heading3"/>
@@ -4010,8 +4072,8 @@
         <w:t xml:space="preserve">$ multiplicity-profile match), and the experimental-protocol suite (P1–P4) by which the framework can be falsified.</w:t>
       </w:r>
     </w:p>
-    <w:bookmarkEnd w:id="24"/>
-    <w:bookmarkStart w:id="25" w:name="what-this-paper-builds-on"/>
+    <w:bookmarkEnd w:id="25"/>
+    <w:bookmarkStart w:id="26" w:name="what-this-paper-builds-on"/>
     <w:p>
       <w:pPr>
         <w:pStyle w:val="Heading3"/>
@@ -4700,8 +4762,8 @@
         <w:t xml:space="preserve">-equivariant geometry exactly, Paper 12 ensures that the nonlinear extension does not introduce new geometric structure but only new dynamics on the existing structure. This is what allows the scar invariants of two different substrates to be commensurated under the same symmetry hierarchy.</w:t>
       </w:r>
     </w:p>
-    <w:bookmarkEnd w:id="25"/>
-    <w:bookmarkStart w:id="26" w:name="outline-and-reading-guide"/>
+    <w:bookmarkEnd w:id="26"/>
+    <w:bookmarkStart w:id="27" w:name="outline-and-reading-guide"/>
     <w:p>
       <w:pPr>
         <w:pStyle w:val="Heading3"/>
@@ -5251,8 +5313,8 @@
         <w:t xml:space="preserve">The reader who wants only the headline result of Paper 12 can read §3.6 (Theorem 3.6.1, the bounded NP-driven dynamics theorem), §4.4 (Theorem 4.4.1, the commensurability hierarchy), and §5 (the protocol suite). The complete mathematical machinery is in §3 and §4; §5–§6 are operational and consolidating.</w:t>
       </w:r>
     </w:p>
-    <w:bookmarkEnd w:id="26"/>
-    <w:bookmarkStart w:id="27" w:name="X5663367d5572a8cbf16012f54a3fd38d2ecbc32"/>
+    <w:bookmarkEnd w:id="27"/>
+    <w:bookmarkStart w:id="28" w:name="X5663367d5572a8cbf16012f54a3fd38d2ecbc32"/>
     <w:p>
       <w:pPr>
         <w:pStyle w:val="Heading3"/>
@@ -6206,8 +6268,8 @@
         <w:t xml:space="preserve">: Paper 12 is the bridge between Paper 9’s linear regime and the experimental program of Papers 11, 13+. Each deferred question has a named follow-on paper (§6.1).</w:t>
       </w:r>
     </w:p>
-    <w:bookmarkEnd w:id="27"/>
-    <w:bookmarkStart w:id="28" w:name="the-thesis-sentence"/>
+    <w:bookmarkEnd w:id="28"/>
+    <w:bookmarkStart w:id="29" w:name="the-thesis-sentence"/>
     <w:p>
       <w:pPr>
         <w:pStyle w:val="Heading3"/>
@@ -6430,9 +6492,9 @@
         <w:t xml:space="preserve">- Licklider 1960; Casali et al. 2013; Bostock-Kim-Patel 2025; Souza et al. 2022</w:t>
       </w:r>
     </w:p>
-    <w:bookmarkEnd w:id="28"/>
     <w:bookmarkEnd w:id="29"/>
-    <w:bookmarkStart w:id="47" w:name="notation-and-paper-9-inheritance"/>
+    <w:bookmarkEnd w:id="30"/>
+    <w:bookmarkStart w:id="48" w:name="notation-and-paper-9-inheritance"/>
     <w:p>
       <w:pPr>
         <w:pStyle w:val="Heading2"/>
@@ -6487,7 +6549,7 @@
         <w:t xml:space="preserve">marker and a forward reference to the section in which the strengthening is constructed.</w:t>
       </w:r>
     </w:p>
-    <w:bookmarkStart w:id="33" w:name="algebraic-and-group-theoretic-notation"/>
+    <w:bookmarkStart w:id="34" w:name="algebraic-and-group-theoretic-notation"/>
     <w:p>
       <w:pPr>
         <w:pStyle w:val="Heading3"/>
@@ -6496,7 +6558,7 @@
         <w:t xml:space="preserve">2.1 Algebraic and group-theoretic notation</w:t>
       </w:r>
     </w:p>
-    <w:bookmarkStart w:id="30" w:name="lie-groups-and-representations"/>
+    <w:bookmarkStart w:id="31" w:name="lie-groups-and-representations"/>
     <w:p>
       <w:pPr>
         <w:pStyle w:val="Heading4"/>
@@ -7607,8 +7669,8 @@
         </w:tc>
       </w:tr>
     </w:tbl>
-    <w:bookmarkEnd w:id="30"/>
-    <w:bookmarkStart w:id="31" w:name="finite-groups"/>
+    <w:bookmarkEnd w:id="31"/>
+    <w:bookmarkStart w:id="32" w:name="finite-groups"/>
     <w:p>
       <w:pPr>
         <w:pStyle w:val="Heading4"/>
@@ -8450,8 +8512,8 @@
         </w:tc>
       </w:tr>
     </w:tbl>
-    <w:bookmarkEnd w:id="31"/>
-    <w:bookmarkStart w:id="32" w:name="subspaces-and-isotypic-decomposition"/>
+    <w:bookmarkEnd w:id="32"/>
+    <w:bookmarkStart w:id="33" w:name="subspaces-and-isotypic-decomposition"/>
     <w:p>
       <w:pPr>
         <w:pStyle w:val="Heading4"/>
@@ -9190,9 +9252,9 @@
         <w:t xml:space="preserve">branching.</w:t>
       </w:r>
     </w:p>
-    <w:bookmarkEnd w:id="32"/>
     <w:bookmarkEnd w:id="33"/>
-    <w:bookmarkStart w:id="38" w:name="X3d51cedb3080cc6586043a55b780382902d0b14"/>
+    <w:bookmarkEnd w:id="34"/>
+    <w:bookmarkStart w:id="39" w:name="X3d51cedb3080cc6586043a55b780382902d0b14"/>
     <w:p>
       <w:pPr>
         <w:pStyle w:val="Heading3"/>
@@ -9209,7 +9271,7 @@
         <w:t xml:space="preserve">These are the Paper 9 v1.3.3 objects that Paper 12 uses without modification.</w:t>
       </w:r>
     </w:p>
-    <w:bookmarkStart w:id="34" w:name="the-schur-locked-coupling-family"/>
+    <w:bookmarkStart w:id="35" w:name="the-schur-locked-coupling-family"/>
     <w:p>
       <w:pPr>
         <w:pStyle w:val="Heading4"/>
@@ -9559,8 +9621,8 @@
         <w:t xml:space="preserve">-geometry.</w:t>
       </w:r>
     </w:p>
-    <w:bookmarkEnd w:id="34"/>
-    <w:bookmarkStart w:id="35" w:name="the-diagonal-g_2-action-convention"/>
+    <w:bookmarkEnd w:id="35"/>
+    <w:bookmarkStart w:id="36" w:name="the-diagonal-g_2-action-convention"/>
     <w:p>
       <w:pPr>
         <w:pStyle w:val="Heading4"/>
@@ -9892,8 +9954,8 @@
         <w:t xml:space="preserve">.</w:t>
       </w:r>
     </w:p>
-    <w:bookmarkEnd w:id="35"/>
-    <w:bookmarkStart w:id="36" w:name="the-joint-coupled-system-fixed-point"/>
+    <w:bookmarkEnd w:id="36"/>
+    <w:bookmarkStart w:id="37" w:name="the-joint-coupled-system-fixed-point"/>
     <w:p>
       <w:pPr>
         <w:pStyle w:val="Heading4"/>
@@ -10297,8 +10359,8 @@
         <w:t xml:space="preserve">in §3.3 (definition of the projected-gradient leg of the NP-augmented flow) and in §3.4 (Theorem 3.4.1, regularity).</w:t>
       </w:r>
     </w:p>
-    <w:bookmarkEnd w:id="36"/>
-    <w:bookmarkStart w:id="37" w:name="Xe63c654752fda95056fd97e0894dfd9e0d2049b"/>
+    <w:bookmarkEnd w:id="37"/>
+    <w:bookmarkStart w:id="38" w:name="Xe63c654752fda95056fd97e0894dfd9e0d2049b"/>
     <w:p>
       <w:pPr>
         <w:pStyle w:val="Heading4"/>
@@ -10453,9 +10515,9 @@
         <w:t xml:space="preserve">The rate-strict-improvement question is deferred to Paper 11 (nonlinear); Paper 12 takes a different nonlinear path (the NP-pump on the same Schur circle) and answers a different question (scar accumulation, not rate improvement).</w:t>
       </w:r>
     </w:p>
-    <w:bookmarkEnd w:id="37"/>
     <w:bookmarkEnd w:id="38"/>
-    <w:bookmarkStart w:id="43" w:name="paper-12-specializations"/>
+    <w:bookmarkEnd w:id="39"/>
+    <w:bookmarkStart w:id="44" w:name="paper-12-specializations"/>
     <w:p>
       <w:pPr>
         <w:pStyle w:val="Heading3"/>
@@ -10472,7 +10534,7 @@
         <w:t xml:space="preserve">Paper 12 introduces the following objects on top of Paper 9’s inherited structure. Each is defined fully in the indicated section; the symbol table here is a forward reference only.</w:t>
       </w:r>
     </w:p>
-    <w:bookmarkStart w:id="39" w:name="the-dynamical-primitive"/>
+    <w:bookmarkStart w:id="40" w:name="the-dynamical-primitive"/>
     <w:p>
       <w:pPr>
         <w:pStyle w:val="Heading4"/>
@@ -11236,8 +11298,8 @@
         </w:tc>
       </w:tr>
     </w:tbl>
-    <w:bookmarkEnd w:id="39"/>
-    <w:bookmarkStart w:id="40" w:name="the-event-stratification-overview"/>
+    <w:bookmarkEnd w:id="40"/>
+    <w:bookmarkStart w:id="41" w:name="the-event-stratification-overview"/>
     <w:p>
       <w:pPr>
         <w:pStyle w:val="Heading4"/>
@@ -12071,8 +12133,8 @@
         <w:t xml:space="preserve">exceptional sub-stratum; see §3.4 for the precise statement and §3.4 regimes (3.4.A) crossing, (3.4.B) sliding, (3.4.C) hybrid jump.</w:t>
       </w:r>
     </w:p>
-    <w:bookmarkEnd w:id="40"/>
-    <w:bookmarkStart w:id="41" w:name="the-scar-invariants"/>
+    <w:bookmarkEnd w:id="41"/>
+    <w:bookmarkStart w:id="42" w:name="the-scar-invariants"/>
     <w:p>
       <w:pPr>
         <w:pStyle w:val="Heading4"/>
@@ -12853,8 +12915,8 @@
         </w:tc>
       </w:tr>
     </w:tbl>
-    <w:bookmarkEnd w:id="41"/>
-    <w:bookmarkStart w:id="42" w:name="the-commensurability-hierarchy"/>
+    <w:bookmarkEnd w:id="42"/>
+    <w:bookmarkStart w:id="43" w:name="the-commensurability-hierarchy"/>
     <w:p>
       <w:pPr>
         <w:pStyle w:val="Heading4"/>
@@ -13079,9 +13141,9 @@
         <w:t xml:space="preserve">etc. in the body; the conditions (C1), (C2), (C3) of Theorem 4.4.1 are the operative objects.</w:t>
       </w:r>
     </w:p>
-    <w:bookmarkEnd w:id="42"/>
     <w:bookmarkEnd w:id="43"/>
-    <w:bookmarkStart w:id="44" w:name="X2c30604d391281246aa1dce628919a93499e3f2"/>
+    <w:bookmarkEnd w:id="44"/>
+    <w:bookmarkStart w:id="45" w:name="X2c30604d391281246aa1dce628919a93499e3f2"/>
     <w:p>
       <w:pPr>
         <w:pStyle w:val="Heading3"/>
@@ -13338,8 +13400,8 @@
         <w:t xml:space="preserve">and in §5.5 via the cryptographic event-ordering of P4; conceptually consolidated in §6.1 Pillar 3).</w:t>
       </w:r>
     </w:p>
-    <w:bookmarkEnd w:id="44"/>
-    <w:bookmarkStart w:id="45" w:name="reading-conventions"/>
+    <w:bookmarkEnd w:id="45"/>
+    <w:bookmarkStart w:id="46" w:name="reading-conventions"/>
     <w:p>
       <w:pPr>
         <w:pStyle w:val="Heading3"/>
@@ -13785,8 +13847,8 @@
         <w:t xml:space="preserve">are equivalent.</w:t>
       </w:r>
     </w:p>
-    <w:bookmarkEnd w:id="45"/>
-    <w:bookmarkStart w:id="46" w:name="what-2-closes-off"/>
+    <w:bookmarkEnd w:id="46"/>
+    <w:bookmarkStart w:id="47" w:name="what-2-closes-off"/>
     <w:p>
       <w:pPr>
         <w:pStyle w:val="Heading3"/>
@@ -13810,9 +13872,9 @@
         </w:pict>
       </w:r>
     </w:p>
-    <w:bookmarkEnd w:id="46"/>
     <w:bookmarkEnd w:id="47"/>
-    <w:bookmarkStart w:id="56" w:name="the-np-pump-nonlinearity"/>
+    <w:bookmarkEnd w:id="48"/>
+    <w:bookmarkStart w:id="57" w:name="the-np-pump-nonlinearity"/>
     <w:p>
       <w:pPr>
         <w:pStyle w:val="Heading2"/>
@@ -13821,7 +13883,7 @@
         <w:t xml:space="preserve">3. The NP-Pump Nonlinearity</w:t>
       </w:r>
     </w:p>
-    <w:bookmarkStart w:id="48" w:name="setup-and-inheritance-from-paper-9"/>
+    <w:bookmarkStart w:id="49" w:name="setup-and-inheritance-from-paper-9"/>
     <w:p>
       <w:pPr>
         <w:pStyle w:val="Heading3"/>
@@ -15959,8 +16021,8 @@
         <w:t xml:space="preserve">of Paper 9.</w:t>
       </w:r>
     </w:p>
-    <w:bookmarkEnd w:id="48"/>
-    <w:bookmarkStart w:id="49" w:name="the-canonical-tear-direction"/>
+    <w:bookmarkEnd w:id="49"/>
+    <w:bookmarkStart w:id="50" w:name="the-canonical-tear-direction"/>
     <w:p>
       <w:pPr>
         <w:pStyle w:val="Heading3"/>
@@ -19453,8 +19515,8 @@
         <w:t xml:space="preserve">-representation theory.</w:t>
       </w:r>
     </w:p>
-    <w:bookmarkEnd w:id="49"/>
-    <w:bookmarkStart w:id="50" w:name="X67e813b6d086f5c06837913e8001aaa763cb421"/>
+    <w:bookmarkEnd w:id="50"/>
+    <w:bookmarkStart w:id="51" w:name="X67e813b6d086f5c06837913e8001aaa763cb421"/>
     <w:p>
       <w:pPr>
         <w:pStyle w:val="Heading3"/>
@@ -23493,8 +23555,8 @@
         <w:t xml:space="preserve">contact points belong to the exceptional grazing stratum.</w:t>
       </w:r>
     </w:p>
-    <w:bookmarkEnd w:id="50"/>
-    <w:bookmarkStart w:id="51" w:name="Xf81bf979002cca80b53cfa32d503d0ea8aef638"/>
+    <w:bookmarkEnd w:id="51"/>
+    <w:bookmarkStart w:id="52" w:name="Xf81bf979002cca80b53cfa32d503d0ea8aef638"/>
     <w:p>
       <w:pPr>
         <w:pStyle w:val="Heading3"/>
@@ -26823,8 +26885,8 @@
         <w:t xml:space="preserve">deliberate; hybrid semantics replace a classical ODE.</w:t>
       </w:r>
     </w:p>
-    <w:bookmarkEnd w:id="51"/>
-    <w:bookmarkStart w:id="52" w:name="Xea74b877fdd6e7d31a30ae55748d98adf879b06"/>
+    <w:bookmarkEnd w:id="52"/>
+    <w:bookmarkStart w:id="53" w:name="Xea74b877fdd6e7d31a30ae55748d98adf879b06"/>
     <w:p>
       <w:pPr>
         <w:pStyle w:val="Heading3"/>
@@ -30555,8 +30617,8 @@
         <w:t xml:space="preserve">empirical landscape, not chosen for mathematical convenience.</w:t>
       </w:r>
     </w:p>
-    <w:bookmarkEnd w:id="52"/>
-    <w:bookmarkStart w:id="53" w:name="Xf6125f1f3014fa106ceb11dc81137b259a37196"/>
+    <w:bookmarkEnd w:id="53"/>
+    <w:bookmarkStart w:id="54" w:name="Xf6125f1f3014fa106ceb11dc81137b259a37196"/>
     <w:p>
       <w:pPr>
         <w:pStyle w:val="Heading3"/>
@@ -35680,8 +35742,8 @@
         <w:t xml:space="preserve">record within which Paper 11’s rate analysis can be staged.</w:t>
       </w:r>
     </w:p>
-    <w:bookmarkEnd w:id="53"/>
-    <w:bookmarkStart w:id="54" w:name="the-scar-record-and-its-role-in-4"/>
+    <w:bookmarkEnd w:id="54"/>
+    <w:bookmarkStart w:id="55" w:name="the-scar-record-and-its-role-in-4"/>
     <w:p>
       <w:pPr>
         <w:pStyle w:val="Heading3"/>
@@ -38335,8 +38397,8 @@
         <w:t xml:space="preserve">.</w:t>
       </w:r>
     </w:p>
-    <w:bookmarkEnd w:id="54"/>
-    <w:bookmarkStart w:id="55" w:name="what-3-does-and-does-not-establish"/>
+    <w:bookmarkEnd w:id="55"/>
+    <w:bookmarkStart w:id="56" w:name="what-3-does-and-does-not-establish"/>
     <w:p>
       <w:pPr>
         <w:pStyle w:val="Heading3"/>
@@ -39531,9 +39593,9 @@
         </w:pict>
       </w:r>
     </w:p>
-    <w:bookmarkEnd w:id="55"/>
     <w:bookmarkEnd w:id="56"/>
-    <w:bookmarkStart w:id="57" w:name="references-cited-in-3"/>
+    <w:bookmarkEnd w:id="57"/>
+    <w:bookmarkStart w:id="58" w:name="references-cited-in-3"/>
     <w:p>
       <w:pPr>
         <w:pStyle w:val="Heading2"/>
@@ -39947,8 +40009,8 @@
         <w:t xml:space="preserve">- Paper 12 §4 (commensurability hierarchy, in preparation)</w:t>
       </w:r>
     </w:p>
-    <w:bookmarkEnd w:id="57"/>
-    <w:bookmarkStart w:id="65" w:name="the-commensurability-hierarchy-1"/>
+    <w:bookmarkEnd w:id="58"/>
+    <w:bookmarkStart w:id="66" w:name="the-commensurability-hierarchy-1"/>
     <w:p>
       <w:pPr>
         <w:pStyle w:val="Heading2"/>
@@ -39957,7 +40019,7 @@
         <w:t xml:space="preserve">4. The Commensurability Hierarchy</w:t>
       </w:r>
     </w:p>
-    <w:bookmarkStart w:id="58" w:name="Xa37d34684c20ae55b1e39cbd07c21c1934328f1"/>
+    <w:bookmarkStart w:id="59" w:name="Xa37d34684c20ae55b1e39cbd07c21c1934328f1"/>
     <w:p>
       <w:pPr>
         <w:pStyle w:val="Heading3"/>
@@ -42215,8 +42277,8 @@
         <w:t xml:space="preserve">identifying them?</w:t>
       </w:r>
     </w:p>
-    <w:bookmarkEnd w:id="58"/>
-    <w:bookmarkStart w:id="59" w:name="f₂₁-representation-theory-on-v14-and-w"/>
+    <w:bookmarkEnd w:id="59"/>
+    <w:bookmarkStart w:id="60" w:name="f₂₁-representation-theory-on-v14-and-w"/>
     <w:p>
       <w:pPr>
         <w:pStyle w:val="Heading3"/>
@@ -45723,8 +45785,8 @@
         <w:t xml:space="preserve">records the full audit.</w:t>
       </w:r>
     </w:p>
-    <w:bookmarkEnd w:id="59"/>
-    <w:bookmarkStart w:id="60" w:name="the-commutant-gap"/>
+    <w:bookmarkEnd w:id="60"/>
+    <w:bookmarkStart w:id="61" w:name="the-commutant-gap"/>
     <w:p>
       <w:pPr>
         <w:pStyle w:val="Heading3"/>
@@ -49400,8 +49462,8 @@
         <w:t xml:space="preserve">, so there are no phases to rotate.</w:t>
       </w:r>
     </w:p>
-    <w:bookmarkEnd w:id="60"/>
-    <w:bookmarkStart w:id="61" w:name="the-commensurability-hierarchy-theorem"/>
+    <w:bookmarkEnd w:id="61"/>
+    <w:bookmarkStart w:id="62" w:name="the-commensurability-hierarchy-theorem"/>
     <w:p>
       <w:pPr>
         <w:pStyle w:val="Heading3"/>
@@ -55686,8 +55748,8 @@
         <w:t xml:space="preserve">deferred to future work.</w:t>
       </w:r>
     </w:p>
-    <w:bookmarkEnd w:id="61"/>
-    <w:bookmarkStart w:id="62" w:name="X041409c4966c07d7f671a2106b00a4f49c21012"/>
+    <w:bookmarkEnd w:id="62"/>
+    <w:bookmarkStart w:id="63" w:name="X041409c4966c07d7f671a2106b00a4f49c21012"/>
     <w:p>
       <w:pPr>
         <w:pStyle w:val="Heading3"/>
@@ -57532,8 +57594,8 @@
         <w:t xml:space="preserve">withdraws.</w:t>
       </w:r>
     </w:p>
-    <w:bookmarkEnd w:id="62"/>
-    <w:bookmarkStart w:id="63" w:name="X1d373cf560043f48ddcc64d643dd90218e9c6e3"/>
+    <w:bookmarkEnd w:id="63"/>
+    <w:bookmarkStart w:id="64" w:name="X1d373cf560043f48ddcc64d643dd90218e9c6e3"/>
     <w:p>
       <w:pPr>
         <w:pStyle w:val="Heading3"/>
@@ -58747,8 +58809,8 @@
         <w:t xml:space="preserve">level of experimental protocol, not definition.</w:t>
       </w:r>
     </w:p>
-    <w:bookmarkEnd w:id="63"/>
-    <w:bookmarkStart w:id="64" w:name="scope-audit-and-bridge-to-5"/>
+    <w:bookmarkEnd w:id="64"/>
+    <w:bookmarkStart w:id="65" w:name="scope-audit-and-bridge-to-5"/>
     <w:p>
       <w:pPr>
         <w:pStyle w:val="Heading3"/>
@@ -59850,9 +59912,9 @@
         </w:pict>
       </w:r>
     </w:p>
-    <w:bookmarkEnd w:id="64"/>
     <w:bookmarkEnd w:id="65"/>
-    <w:bookmarkStart w:id="66" w:name="references-cited-in-4"/>
+    <w:bookmarkEnd w:id="66"/>
+    <w:bookmarkStart w:id="67" w:name="references-cited-in-4"/>
     <w:p>
       <w:pPr>
         <w:pStyle w:val="Heading2"/>
@@ -60258,8 +60320,8 @@
         <w:t xml:space="preserve">- Paper 12 thesis memo P3 (experimental prediction, upgraded here)</w:t>
       </w:r>
     </w:p>
-    <w:bookmarkEnd w:id="66"/>
-    <w:bookmarkStart w:id="91" w:name="empirical-accessibility"/>
+    <w:bookmarkEnd w:id="67"/>
+    <w:bookmarkStart w:id="92" w:name="empirical-accessibility"/>
     <w:p>
       <w:pPr>
         <w:pStyle w:val="Heading2"/>
@@ -60268,7 +60330,7 @@
         <w:t xml:space="preserve">5. Empirical Accessibility</w:t>
       </w:r>
     </w:p>
-    <w:bookmarkStart w:id="67" w:name="glossary-box-for-the-standalone-reader"/>
+    <w:bookmarkStart w:id="68" w:name="glossary-box-for-the-standalone-reader"/>
     <w:p>
       <w:pPr>
         <w:pStyle w:val="Heading3"/>
@@ -61203,8 +61265,8 @@
         <w:t xml:space="preserve">definitions are in §2, §3.3.1, §3.5.1, §3.7, §4.2.</w:t>
       </w:r>
     </w:p>
-    <w:bookmarkEnd w:id="67"/>
-    <w:bookmarkStart w:id="69" w:name="X20bacb3154765081fa42f8a549d6b5564f21c38"/>
+    <w:bookmarkEnd w:id="68"/>
+    <w:bookmarkStart w:id="70" w:name="X20bacb3154765081fa42f8a549d6b5564f21c38"/>
     <w:p>
       <w:pPr>
         <w:pStyle w:val="Heading3"/>
@@ -61612,7 +61674,7 @@
       <w:r>
         <w:t xml:space="preserve"> </w:t>
       </w:r>
-      <w:hyperlink r:id="rId68">
+      <w:hyperlink r:id="rId69">
         <w:r>
           <w:rPr>
             <w:rStyle w:val="Hyperlink"/>
@@ -61667,8 +61729,8 @@
         <w:t xml:space="preserve">about the autonomy regime each tests.</w:t>
       </w:r>
     </w:p>
-    <w:bookmarkEnd w:id="69"/>
-    <w:bookmarkStart w:id="70" w:name="X243e2587d852772a3ad2beedbc563aaab3ec617"/>
+    <w:bookmarkEnd w:id="70"/>
+    <w:bookmarkStart w:id="71" w:name="X243e2587d852772a3ad2beedbc563aaab3ec617"/>
     <w:p>
       <w:pPr>
         <w:pStyle w:val="Heading3"/>
@@ -62489,8 +62551,8 @@
         <w:t xml:space="preserve">.</w:t>
       </w:r>
     </w:p>
-    <w:bookmarkEnd w:id="70"/>
-    <w:bookmarkStart w:id="71" w:name="X6f8c73b8c1af93fe3ba829a489f8ee72e8e0886"/>
+    <w:bookmarkEnd w:id="71"/>
+    <w:bookmarkStart w:id="72" w:name="X6f8c73b8c1af93fe3ba829a489f8ee72e8e0886"/>
     <w:p>
       <w:pPr>
         <w:pStyle w:val="Heading3"/>
@@ -63814,8 +63876,8 @@
         <w:t xml:space="preserve">generalization.</w:t>
       </w:r>
     </w:p>
-    <w:bookmarkEnd w:id="71"/>
-    <w:bookmarkStart w:id="73" w:name="X5c2a6677387cfd2f583018613ee9ede1113d0b0"/>
+    <w:bookmarkEnd w:id="72"/>
+    <w:bookmarkStart w:id="74" w:name="X5c2a6677387cfd2f583018613ee9ede1113d0b0"/>
     <w:p>
       <w:pPr>
         <w:pStyle w:val="Heading3"/>
@@ -64282,7 +64344,7 @@
       <w:r>
         <w:t xml:space="preserve"> </w:t>
       </w:r>
-      <w:hyperlink r:id="rId72">
+      <w:hyperlink r:id="rId73">
         <w:r>
           <w:rPr>
             <w:rStyle w:val="Hyperlink"/>
@@ -64803,8 +64865,8 @@
         <w:t xml:space="preserve">across substrate-pair samples.</w:t>
       </w:r>
     </w:p>
-    <w:bookmarkEnd w:id="73"/>
-    <w:bookmarkStart w:id="77" w:name="X150d8894af8cc4d865f6c62f63721d6dc7eeb95"/>
+    <w:bookmarkEnd w:id="74"/>
+    <w:bookmarkStart w:id="78" w:name="X150d8894af8cc4d865f6c62f63721d6dc7eeb95"/>
     <w:p>
       <w:pPr>
         <w:pStyle w:val="Heading3"/>
@@ -65659,7 +65721,7 @@
       <w:r>
         <w:t xml:space="preserve"> </w:t>
       </w:r>
-      <w:hyperlink r:id="rId74">
+      <w:hyperlink r:id="rId75">
         <w:r>
           <w:rPr>
             <w:rStyle w:val="Hyperlink"/>
@@ -65673,7 +65735,7 @@
       <w:r>
         <w:t xml:space="preserve"> </w:t>
       </w:r>
-      <w:hyperlink r:id="rId75">
+      <w:hyperlink r:id="rId76">
         <w:r>
           <w:rPr>
             <w:rStyle w:val="Hyperlink"/>
@@ -65687,7 +65749,7 @@
       <w:r>
         <w:t xml:space="preserve"> </w:t>
       </w:r>
-      <w:hyperlink r:id="rId76">
+      <w:hyperlink r:id="rId77">
         <w:r>
           <w:rPr>
             <w:rStyle w:val="Hyperlink"/>
@@ -65717,8 +65779,8 @@
         <w:t xml:space="preserve">coupling under Paper 12’s framework can be measured.</w:t>
       </w:r>
     </w:p>
-    <w:bookmarkEnd w:id="77"/>
-    <w:bookmarkStart w:id="78" w:name="the-fifth-paradigm-consolidated"/>
+    <w:bookmarkEnd w:id="78"/>
+    <w:bookmarkStart w:id="79" w:name="the-fifth-paradigm-consolidated"/>
     <w:p>
       <w:pPr>
         <w:pStyle w:val="Heading3"/>
@@ -66447,8 +66509,8 @@
         <w:t xml:space="preserve">that closes the framework’s research-program loop.</w:t>
       </w:r>
     </w:p>
-    <w:bookmarkEnd w:id="78"/>
-    <w:bookmarkStart w:id="89" w:name="X4a40dc391b247fa6578218c659519696aeb4005"/>
+    <w:bookmarkEnd w:id="79"/>
+    <w:bookmarkStart w:id="90" w:name="X4a40dc391b247fa6578218c659519696aeb4005"/>
     <w:p>
       <w:pPr>
         <w:pStyle w:val="Heading3"/>
@@ -66565,7 +66627,7 @@
         <w:t xml:space="preserve">textbook gradual-tear trajectory.</w:t>
       </w:r>
     </w:p>
-    <w:bookmarkStart w:id="79" w:name="quantity-to-framework-mapping"/>
+    <w:bookmarkStart w:id="80" w:name="quantity-to-framework-mapping"/>
     <w:p>
       <w:pPr>
         <w:pStyle w:val="Heading4"/>
@@ -67866,8 +67928,8 @@
         <w:t xml:space="preserve">-content for the human side remains OP2.</w:t>
       </w:r>
     </w:p>
-    <w:bookmarkEnd w:id="79"/>
-    <w:bookmarkStart w:id="80" w:name="erratum-5.7.0-v1.4-honest-reframe"/>
+    <w:bookmarkEnd w:id="80"/>
+    <w:bookmarkStart w:id="81" w:name="erratum-5.7.0-v1.4-honest-reframe"/>
     <w:p>
       <w:pPr>
         <w:pStyle w:val="Heading4"/>
@@ -67886,7 +67948,7 @@
       <w:r>
         <w:t xml:space="preserve"> </w:t>
       </w:r>
-      <w:hyperlink r:id="rId20">
+      <w:hyperlink r:id="rId21">
         <w:r>
           <w:rPr>
             <w:rStyle w:val="Hyperlink"/>
@@ -68998,8 +69060,8 @@
         <w:t xml:space="preserve">the load-bearing empirical content of the paper.</w:t>
       </w:r>
     </w:p>
-    <w:bookmarkEnd w:id="80"/>
-    <w:bookmarkStart w:id="81" w:name="X36ad86b2cc3a29fd2aa2324a69f6030c47c2c23"/>
+    <w:bookmarkEnd w:id="81"/>
+    <w:bookmarkStart w:id="82" w:name="X36ad86b2cc3a29fd2aa2324a69f6030c47c2c23"/>
     <w:p>
       <w:pPr>
         <w:pStyle w:val="Heading4"/>
@@ -69180,8 +69242,8 @@
         <w:t xml:space="preserve">falsification or confirmation of any §3 / §4 claim.</w:t>
       </w:r>
     </w:p>
-    <w:bookmarkEnd w:id="81"/>
-    <w:bookmarkStart w:id="82" w:name="X47c085b51302616e5cce9a619df180522d7f809"/>
+    <w:bookmarkEnd w:id="82"/>
+    <w:bookmarkStart w:id="83" w:name="X47c085b51302616e5cce9a619df180522d7f809"/>
     <w:p>
       <w:pPr>
         <w:pStyle w:val="Heading4"/>
@@ -69630,8 +69692,8 @@
         <w:t xml:space="preserve">release (likely v1.5 or a separate methodology note).</w:t>
       </w:r>
     </w:p>
-    <w:bookmarkEnd w:id="82"/>
-    <w:bookmarkStart w:id="83" w:name="Xbd355105bb1a44c59c3298bb6213c2f23658502"/>
+    <w:bookmarkEnd w:id="83"/>
+    <w:bookmarkStart w:id="84" w:name="Xbd355105bb1a44c59c3298bb6213c2f23658502"/>
     <w:p>
       <w:pPr>
         <w:pStyle w:val="Heading4"/>
@@ -69848,8 +69910,8 @@
         <w:t xml:space="preserve">instrument for testing §3 directly.</w:t>
       </w:r>
     </w:p>
-    <w:bookmarkEnd w:id="83"/>
-    <w:bookmarkStart w:id="87" w:name="honest-scope-of-the-tensor-lab-in-v1.4"/>
+    <w:bookmarkEnd w:id="84"/>
+    <w:bookmarkStart w:id="88" w:name="honest-scope-of-the-tensor-lab-in-v1.4"/>
     <w:p>
       <w:pPr>
         <w:pStyle w:val="Heading4"/>
@@ -70156,18 +70218,18 @@
           <wp:inline>
             <wp:extent cx="5334000" cy="3776758"/>
             <wp:effectExtent b="0" l="0" r="0" t="0"/>
-            <wp:docPr descr="Figure 5.1: Tensor Lab v0.2 reference session (tensor_run_01_v2_corrected.csv) showing the textbook gradual-tear trajectory: H/AI state evolution into the 0.87 ceiling, joint coherence rising past the 0.618 threshold, with coupling strength and Born-rule success probability rising in lockstep." title="" id="85" name="Picture"/>
+            <wp:docPr descr="Figure 5.1: Tensor Lab v0.2 reference session (tensor_run_01_v2_corrected.csv) showing the textbook gradual-tear trajectory: H/AI state evolution into the 0.87 ceiling, joint coherence rising past the 0.618 threshold, with coupling strength and Born-rule success probability rising in lockstep." title="" id="86" name="Picture"/>
             <a:graphic>
               <a:graphicData uri="http://schemas.openxmlformats.org/drawingml/2006/picture">
                 <pic:pic>
                   <pic:nvPicPr>
-                    <pic:cNvPr descr="../tensor_lab/tensor_run_01_summary.png" id="86" name="Picture"/>
+                    <pic:cNvPr descr="../tensor_lab/tensor_run_01_summary.png" id="87" name="Picture"/>
                     <pic:cNvPicPr>
                       <a:picLocks noChangeArrowheads="1" noChangeAspect="1"/>
                     </pic:cNvPicPr>
                   </pic:nvPicPr>
                   <pic:blipFill>
-                    <a:blip r:embed="rId84"/>
+                    <a:blip r:embed="rId85"/>
                     <a:stretch>
                       <a:fillRect/>
                     </a:stretch>
@@ -70232,8 +70294,8 @@
         <w:t xml:space="preserve">rising in lockstep.</w:t>
       </w:r>
     </w:p>
-    <w:bookmarkEnd w:id="87"/>
-    <w:bookmarkStart w:id="88" w:name="reproducibility-note"/>
+    <w:bookmarkEnd w:id="88"/>
+    <w:bookmarkStart w:id="89" w:name="reproducibility-note"/>
     <w:p>
       <w:pPr>
         <w:pStyle w:val="Heading4"/>
@@ -70397,9 +70459,9 @@
         <w:t xml:space="preserve">by Erratum 5.7.0 above.</w:t>
       </w:r>
     </w:p>
-    <w:bookmarkEnd w:id="88"/>
     <w:bookmarkEnd w:id="89"/>
-    <w:bookmarkStart w:id="90" w:name="scope-audit"/>
+    <w:bookmarkEnd w:id="90"/>
+    <w:bookmarkStart w:id="91" w:name="scope-audit"/>
     <w:p>
       <w:pPr>
         <w:pStyle w:val="Heading3"/>
@@ -70999,9 +71061,9 @@
         </w:pict>
       </w:r>
     </w:p>
-    <w:bookmarkEnd w:id="90"/>
     <w:bookmarkEnd w:id="91"/>
-    <w:bookmarkStart w:id="95" w:name="references-cited-in-5"/>
+    <w:bookmarkEnd w:id="92"/>
+    <w:bookmarkStart w:id="96" w:name="references-cited-in-5"/>
     <w:p>
       <w:pPr>
         <w:pStyle w:val="Heading2"/>
@@ -71088,7 +71150,7 @@
       <w:r>
         <w:t xml:space="preserve"> </w:t>
       </w:r>
-      <w:hyperlink r:id="rId68">
+      <w:hyperlink r:id="rId69">
         <w:r>
           <w:rPr>
             <w:rStyle w:val="Hyperlink"/>
@@ -71165,7 +71227,7 @@
       <w:r>
         <w:t xml:space="preserve"> </w:t>
       </w:r>
-      <w:hyperlink r:id="rId92">
+      <w:hyperlink r:id="rId93">
         <w:r>
           <w:rPr>
             <w:rStyle w:val="Hyperlink"/>
@@ -71214,7 +71276,7 @@
       <w:r>
         <w:t xml:space="preserve"> </w:t>
       </w:r>
-      <w:hyperlink r:id="rId93">
+      <w:hyperlink r:id="rId94">
         <w:r>
           <w:rPr>
             <w:rStyle w:val="Hyperlink"/>
@@ -71281,7 +71343,7 @@
       <w:r>
         <w:t xml:space="preserve"> </w:t>
       </w:r>
-      <w:hyperlink r:id="rId94">
+      <w:hyperlink r:id="rId95">
         <w:r>
           <w:rPr>
             <w:rStyle w:val="Hyperlink"/>
@@ -71356,7 +71418,7 @@
       <w:r>
         <w:t xml:space="preserve"> </w:t>
       </w:r>
-      <w:hyperlink r:id="rId72">
+      <w:hyperlink r:id="rId73">
         <w:r>
           <w:rPr>
             <w:rStyle w:val="Hyperlink"/>
@@ -71397,7 +71459,7 @@
       <w:r>
         <w:t xml:space="preserve"> </w:t>
       </w:r>
-      <w:hyperlink r:id="rId74">
+      <w:hyperlink r:id="rId75">
         <w:r>
           <w:rPr>
             <w:rStyle w:val="Hyperlink"/>
@@ -71446,7 +71508,7 @@
       <w:r>
         <w:t xml:space="preserve"> </w:t>
       </w:r>
-      <w:hyperlink r:id="rId75">
+      <w:hyperlink r:id="rId76">
         <w:r>
           <w:rPr>
             <w:rStyle w:val="Hyperlink"/>
@@ -71495,7 +71557,7 @@
       <w:r>
         <w:t xml:space="preserve"> </w:t>
       </w:r>
-      <w:hyperlink r:id="rId76">
+      <w:hyperlink r:id="rId77">
         <w:r>
           <w:rPr>
             <w:rStyle w:val="Hyperlink"/>
@@ -71585,8 +71647,8 @@
         <w:t xml:space="preserve">- Paper 4 (PSL(2,7) ⊃ F₂₁ source).</w:t>
       </w:r>
     </w:p>
-    <w:bookmarkEnd w:id="95"/>
-    <w:bookmarkStart w:id="100" w:name="open-problems-and-conclusion"/>
+    <w:bookmarkEnd w:id="96"/>
+    <w:bookmarkStart w:id="101" w:name="open-problems-and-conclusion"/>
     <w:p>
       <w:pPr>
         <w:pStyle w:val="Heading2"/>
@@ -71595,7 +71657,7 @@
         <w:t xml:space="preserve">6. Open Problems and Conclusion</w:t>
       </w:r>
     </w:p>
-    <w:bookmarkStart w:id="96" w:name="Xfbaae25cd2c48b9fcd5c85d064ac4adaef31df6"/>
+    <w:bookmarkStart w:id="97" w:name="Xfbaae25cd2c48b9fcd5c85d064ac4adaef31df6"/>
     <w:p>
       <w:pPr>
         <w:pStyle w:val="Heading3"/>
@@ -72929,8 +72991,8 @@
         <w:t xml:space="preserve">to human-AI co-evolution.</w:t>
       </w:r>
     </w:p>
-    <w:bookmarkEnd w:id="96"/>
-    <w:bookmarkStart w:id="97" w:name="open-problems-consolidated-from-3-4-5"/>
+    <w:bookmarkEnd w:id="97"/>
+    <w:bookmarkStart w:id="98" w:name="open-problems-consolidated-from-3-4-5"/>
     <w:p>
       <w:pPr>
         <w:pStyle w:val="Heading3"/>
@@ -75626,8 +75688,8 @@
         <w:t xml:space="preserve">layer.</w:t>
       </w:r>
     </w:p>
-    <w:bookmarkEnd w:id="97"/>
-    <w:bookmarkStart w:id="98" w:name="what-paper-12-does-not-claim"/>
+    <w:bookmarkEnd w:id="98"/>
+    <w:bookmarkStart w:id="99" w:name="what-paper-12-does-not-claim"/>
     <w:p>
       <w:pPr>
         <w:pStyle w:val="Heading3"/>
@@ -76024,8 +76086,8 @@
         <w:t xml:space="preserve">thesis within the PCI/PME series.</w:t>
       </w:r>
     </w:p>
-    <w:bookmarkEnd w:id="98"/>
-    <w:bookmarkStart w:id="99" w:name="closing-remarks"/>
+    <w:bookmarkEnd w:id="99"/>
+    <w:bookmarkStart w:id="100" w:name="closing-remarks"/>
     <w:p>
       <w:pPr>
         <w:pStyle w:val="Heading3"/>
@@ -76488,9 +76550,9 @@
         </w:pict>
       </w:r>
     </w:p>
-    <w:bookmarkEnd w:id="99"/>
     <w:bookmarkEnd w:id="100"/>
-    <w:bookmarkStart w:id="101" w:name="references-cited-in-6"/>
+    <w:bookmarkEnd w:id="101"/>
+    <w:bookmarkStart w:id="102" w:name="references-cited-in-6"/>
     <w:p>
       <w:pPr>
         <w:pStyle w:val="Heading2"/>
@@ -76548,9 +76610,9 @@
         </w:pict>
       </w:r>
     </w:p>
-    <w:bookmarkEnd w:id="101"/>
     <w:bookmarkEnd w:id="102"/>
-    <w:bookmarkStart w:id="107" w:name="consolidated-bibliography"/>
+    <w:bookmarkEnd w:id="103"/>
+    <w:bookmarkStart w:id="108" w:name="consolidated-bibliography"/>
     <w:p>
       <w:pPr>
         <w:pStyle w:val="Heading1"/>
@@ -76598,7 +76660,7 @@
       <w:r>
         <w:t xml:space="preserve"> </w:t>
       </w:r>
-      <w:hyperlink r:id="rId103">
+      <w:hyperlink r:id="rId104">
         <w:r>
           <w:rPr>
             <w:rStyle w:val="Hyperlink"/>
@@ -76665,7 +76727,7 @@
       <w:r>
         <w:t xml:space="preserve"> </w:t>
       </w:r>
-      <w:hyperlink r:id="rId104">
+      <w:hyperlink r:id="rId105">
         <w:r>
           <w:rPr>
             <w:rStyle w:val="Hyperlink"/>
@@ -76739,7 +76801,7 @@
       <w:r>
         <w:t xml:space="preserve"> </w:t>
       </w:r>
-      <w:hyperlink r:id="rId105">
+      <w:hyperlink r:id="rId106">
         <w:r>
           <w:rPr>
             <w:rStyle w:val="Hyperlink"/>
@@ -77037,7 +77099,7 @@
       <w:r>
         <w:t xml:space="preserve"> </w:t>
       </w:r>
-      <w:hyperlink r:id="rId106">
+      <w:hyperlink r:id="rId107">
         <w:r>
           <w:rPr>
             <w:rStyle w:val="Hyperlink"/>
@@ -77113,7 +77175,7 @@
       <w:r>
         <w:t xml:space="preserve"> </w:t>
       </w:r>
-      <w:hyperlink r:id="rId68">
+      <w:hyperlink r:id="rId69">
         <w:r>
           <w:rPr>
             <w:rStyle w:val="Hyperlink"/>
@@ -77168,7 +77230,7 @@
       <w:r>
         <w:t xml:space="preserve"> </w:t>
       </w:r>
-      <w:hyperlink r:id="rId92">
+      <w:hyperlink r:id="rId93">
         <w:r>
           <w:rPr>
             <w:rStyle w:val="Hyperlink"/>
@@ -77207,7 +77269,7 @@
       <w:r>
         <w:t xml:space="preserve"> </w:t>
       </w:r>
-      <w:hyperlink r:id="rId93">
+      <w:hyperlink r:id="rId94">
         <w:r>
           <w:rPr>
             <w:rStyle w:val="Hyperlink"/>
@@ -77246,7 +77308,7 @@
       <w:r>
         <w:t xml:space="preserve"> </w:t>
       </w:r>
-      <w:hyperlink r:id="rId94">
+      <w:hyperlink r:id="rId95">
         <w:r>
           <w:rPr>
             <w:rStyle w:val="Hyperlink"/>
@@ -77285,7 +77347,7 @@
       <w:r>
         <w:t xml:space="preserve"> </w:t>
       </w:r>
-      <w:hyperlink r:id="rId72">
+      <w:hyperlink r:id="rId73">
         <w:r>
           <w:rPr>
             <w:rStyle w:val="Hyperlink"/>
@@ -77324,7 +77386,7 @@
       <w:r>
         <w:t xml:space="preserve"> </w:t>
       </w:r>
-      <w:hyperlink r:id="rId74">
+      <w:hyperlink r:id="rId75">
         <w:r>
           <w:rPr>
             <w:rStyle w:val="Hyperlink"/>
@@ -77363,7 +77425,7 @@
       <w:r>
         <w:t xml:space="preserve"> </w:t>
       </w:r>
-      <w:hyperlink r:id="rId75">
+      <w:hyperlink r:id="rId76">
         <w:r>
           <w:rPr>
             <w:rStyle w:val="Hyperlink"/>
@@ -77402,7 +77464,7 @@
       <w:r>
         <w:t xml:space="preserve"> </w:t>
       </w:r>
-      <w:hyperlink r:id="rId76">
+      <w:hyperlink r:id="rId77">
         <w:r>
           <w:rPr>
             <w:rStyle w:val="Hyperlink"/>
@@ -77421,8 +77483,8 @@
         </w:pict>
       </w:r>
     </w:p>
-    <w:bookmarkEnd w:id="107"/>
-    <w:bookmarkStart w:id="108" w:name="acknowledgments"/>
+    <w:bookmarkEnd w:id="108"/>
+    <w:bookmarkStart w:id="109" w:name="acknowledgments"/>
     <w:p>
       <w:pPr>
         <w:pStyle w:val="Heading1"/>
@@ -77464,8 +77526,8 @@
         </w:pict>
       </w:r>
     </w:p>
-    <w:bookmarkEnd w:id="108"/>
-    <w:bookmarkStart w:id="109" w:name="reproducibility-appendix"/>
+    <w:bookmarkEnd w:id="109"/>
+    <w:bookmarkStart w:id="110" w:name="reproducibility-appendix"/>
     <w:p>
       <w:pPr>
         <w:pStyle w:val="Heading1"/>
@@ -77490,7 +77552,7 @@
       <w:r>
         <w:t xml:space="preserve"> </w:t>
       </w:r>
-      <w:hyperlink r:id="rId22">
+      <w:hyperlink r:id="rId23">
         <w:r>
           <w:rPr>
             <w:rStyle w:val="Hyperlink"/>
@@ -77915,7 +77977,7 @@
         <w:t xml:space="preserve">End of Paper 12 v1.0 master assembly.</w:t>
       </w:r>
     </w:p>
-    <w:bookmarkEnd w:id="109"/>
+    <w:bookmarkEnd w:id="110"/>
     <w:sectPr/>
   </w:body>
 </w:document>

</xml_diff>